<commit_message>
feat(07-02): update template API and regenerate .docx templates with household placeholders
- Add household member query to template API route after assessment ownership check
- Build HouseholdProfile from database results and pass to mapAssessmentToTemplate
- Add household member placeholders to all 7 template contents:
  - Responsible Parties section with householdHead and role-specific member lists
  - Decision makers in voting/approval sections
  - Trustees and beneficiaries in trust governance
  - Successors in succession planning
  - Advisors in family business governance
  - Executors as records custodians
- Fix ES module compatibility in create-templates.ts
- Regenerate all .docx files with household placeholders
</commit_message>
<xml_diff>
--- a/templates/access-controls.docx
+++ b/templates/access-controls.docx
@@ -13,6 +13,10 @@
 INFORMATION SECURITY & ACCESS MANAGEMENT
 
 This policy defines asset access tiers and approval workflows for the {familyName} family.
+
+RESPONSIBLE PARTIES:
+Primary Authority: {householdHead}
+Access Approval Authority: {decisionMakers}
 
 IDENTIFIED GAPS TO ADDRESS:
 {#gaps}• {description} - {severity} Priority
@@ -31,6 +35,7 @@
 ACCESS CONTROL FRAMEWORK:
 1. Asset access tier definitions and restrictions
 2. Approval workflow requirements by asset type
+   Approving authorities: {decisionMakers}
 3. Information sharing protocols and confidentiality
 4. Digital access management and security measures</w:t>
       </w:r>

</xml_diff>